<commit_message>
Publish PLOS ONE materials and remove superseded journal submission assets
</commit_message>
<xml_diff>
--- a/research_runs/PLOS_ONE_SUBMISSION/PLOS_ONE_Cover_Letter.docx
+++ b/research_runs/PLOS_ONE_SUBMISSION/PLOS_ONE_Cover_Letter.docx
@@ -7,12 +7,7 @@
         <w:pStyle w:val="Title"/>
       </w:pPr>
       <w:r>
-        <w:t>PLOS ONE cover letter — prepared draft</w:t>
-      </w:r>
-    </w:p>
-    <w:p>
-      <w:r>
-        <w:t>PREPARED DRAFT — NOT FOR SUBMISSION: the author reports that the same manuscript is currently under consideration at Journal of Neural Engineering. Formal PLOS ONE submission is blocked until that consideration has ended.</w:t>
+        <w:t>Cover letter — PLOS ONE Research Article</w:t>
       </w:r>
     </w:p>
     <w:p>
@@ -22,22 +17,22 @@
     </w:p>
     <w:p>
       <w:r>
-        <w:t>This prepared Research Article, “Source-only model selection and limits of fixed spectral-sharing pipelines in cross-subject motor-imagery EEG decoding”, examines how source-only training-duration selection, participant heterogeneity and frozen external evaluation constrain claims about calibration-free motor-imagery EEG decoding.</w:t>
+        <w:t>Please consider this Research Article, “Source-only model selection and limits of fixed spectral-sharing pipelines in cross-subject motor-imagery EEG decoding”, for publication in PLOS ONE.</w:t>
       </w:r>
     </w:p>
     <w:p>
       <w:r>
-        <w:t>The study audits completed source-only development conditions and retains all participant-level and adverse or uncertain external results. Its contribution is an inspectable model-selection and evaluation evidence chain, rather than a new state-of-the-art domain-generalization algorithm. The separate BNCI sensor-level analysis is descriptive and does not attribute decoder mechanisms. The manuscript reports reproducible methods, uncertainty and limitations relevant to the technically sound, evidence-supported research considered by PLOS ONE.</w:t>
+        <w:t>The study examines how source-only training-duration selection and participant heterogeneity constrain claims about calibration-free motor-imagery EEG decoding. It combines a model-selection audit with frozen external evaluation and retains adverse and uncertain findings. The contribution is a reproducible selection and evaluation evidence chain, rather than a new state-of-the-art domain-generalization algorithm. A separate sensor-level physiological analysis is descriptive and does not establish a decoder mechanism.</w:t>
       </w:r>
     </w:p>
     <w:p>
       <w:r>
-        <w:t>Manuscript candidates, code and frozen results are publicly accessible on GitHub. The author reports no prior journal or preprint-platform publication. Original EEG remains accessible from the third-party providers; saved predictions, derived summaries and validation evidence are supplied or linked. AI assistance is disclosed in the Methods. Funding and competing-interest statements are provided separately for the submission system.</w:t>
+        <w:t>The manuscript provides documented methods, participant-level outcomes, uncertainty estimates and explicit limitations. Code, manuscript candidates and frozen research outputs are publicly accessible on GitHub. The author reports no prior journal or preprint-platform publication. Original EEG is obtained from the original providers; saved predictions, derived summaries and validation evidence are supplied or linked. AI assistance and author verification are disclosed in the Methods. Funding and competing-interest statements are provided in the submission fields.</w:t>
       </w:r>
     </w:p>
     <w:p>
       <w:r>
-        <w:t>No PLOS ONE submission is being made with this draft. The exclusivity declaration, final approval of the PLOS-formatted files and any fee-assistance application must be completed by the author after the JNE status permits submission.</w:t>
+        <w:t>I am the sole and corresponding author and take responsibility for the scientific content. Please address correspondence to the contact details below.</w:t>
       </w:r>
     </w:p>
     <w:p>

</xml_diff>

<commit_message>
Finalize PLOS author declarations and record-supported research access dates
</commit_message>
<xml_diff>
--- a/research_runs/PLOS_ONE_SUBMISSION/PLOS_ONE_Cover_Letter.docx
+++ b/research_runs/PLOS_ONE_SUBMISSION/PLOS_ONE_Cover_Letter.docx
@@ -32,7 +32,7 @@
     </w:p>
     <w:p>
       <w:r>
-        <w:t>I am the sole and corresponding author and take responsibility for the scientific content. Please address correspondence to the contact details below.</w:t>
+        <w:t>I am the sole and corresponding author and have approved the manuscript. I take responsibility for its scientific content. I have no opposed reviewers. Suggested Academic Editors are Marie-Constance Corsi (Inria Centre de Recherche de Paris) and Cota Navin Gupta (Indian Institute of Technology Guwahati), whose expertise covers EEG motor imagery, decoding and signal analysis.</w:t>
       </w:r>
     </w:p>
     <w:p>
@@ -44,6 +44,8 @@
         <w:t>College of Artificial Intelligence Medicine, Chongqing Medical University, Chongqing, China</w:t>
         <w:br/>
         <w:t>zzy2630816871@gmail.com</w:t>
+        <w:br/>
+        <w:t>ORCID: https://orcid.org/0009-0005-1153-4926</w:t>
       </w:r>
     </w:p>
     <w:sectPr>

</xml_diff>